<commit_message>
Runda 3, stavka 35: vodič za živi test (md + docx), OSTALO ažurirano
Co-Authored-By: Claude Opus 5.5 <noreply@anthropic.com>
</commit_message>
<xml_diff>
--- a/PSE Riemann — OSTALO.docx
+++ b/PSE Riemann — OSTALO.docx
@@ -1025,14 +1025,27 @@
         <w:t xml:space="preserve">1.	</w:t>
       </w:r>
       <w:r>
-        <w:rPr>
-          <w:b/>
-          <w:bCs/>
-        </w:rPr>
-        <w:t xml:space="preserve">35 · Vodič za živi test</w:t>
-      </w:r>
-      <w:r>
-        <w:t xml:space="preserve"> kao poseban dokument (gornji koraci, detaljnije, sa ključevima).</w:t>
+        <w:t xml:space="preserve">~~35 · Vodič za živi test~~ — </w:t>
+      </w:r>
+      <w:r>
+        <w:rPr>
+          <w:b/>
+          <w:bCs/>
+        </w:rPr>
+        <w:t xml:space="preserve">gotovo</w:t>
+      </w:r>
+      <w:r>
+        <w:t xml:space="preserve">: </w:t>
+      </w:r>
+      <w:r>
+        <w:rPr>
+          <w:rFonts w:ascii="Consolas" w:cs="Consolas" w:eastAsia="Consolas" w:hAnsi="Consolas"/>
+          <w:color w:val="6B4A12"/>
+        </w:rPr>
+        <w:t xml:space="preserve">PSE Riemann — VODIC ZIVI TEST.docx</w:t>
+      </w:r>
+      <w:r>
+        <w:t xml:space="preserve"> (Desktop i repo). Radi test po njemu.</w:t>
       </w:r>
     </w:p>
     <w:p>
@@ -1509,7 +1522,7 @@
         <w:sz w:val="16"/>
         <w:szCs w:val="16"/>
       </w:rPr>
-      <w:t xml:space="preserve">PSE Riemann — plan · strana </w:t>
+      <w:t xml:space="preserve">PSE Riemann — šta je ostalo (stanje 2026-10-26, uveče) · strana </w:t>
     </w:r>
     <w:r>
       <w:rPr>

</xml_diff>

<commit_message>
rc2: vodič za živi test i OSTALO usklađeni (folder rezultata, izbor modela)
Co-Authored-By: Claude Opus 5.5 <noreply@anthropic.com>
</commit_message>
<xml_diff>
--- a/PSE Riemann — OSTALO.docx
+++ b/PSE Riemann — OSTALO.docx
@@ -71,7 +71,7 @@
           <w:b/>
           <w:bCs/>
         </w:rPr>
-        <w:t xml:space="preserve">B — `pse-riemann_0.2.0~rc1_amd64.deb`</w:t>
+        <w:t xml:space="preserve">B — `pse-riemann_0.2.0~rc2_amd64.deb`</w:t>
       </w:r>
       <w:r>
         <w:t xml:space="preserve"> (puni: sve, uključujući lokalni DeepSeek preko llama-cpp) leži na Desktopu i u </w:t>
@@ -671,7 +671,7 @@
           <w:rFonts w:ascii="Consolas" w:cs="Consolas" w:eastAsia="Consolas" w:hAnsi="Consolas"/>
           <w:color w:val="6B4A12"/>
         </w:rPr>
-        <w:t xml:space="preserve">sudo apt install ~/Desktop/pse-riemann_0.2.0~rc1_amd64.deb</w:t>
+        <w:t xml:space="preserve">sudo apt install ~/Desktop/pse-riemann_0.2.0~rc2_amd64.deb</w:t>
       </w:r>
     </w:p>
     <w:p>

</xml_diff>